<commit_message>
Horizontal swing labels beside the line; American spelling
Show CSH/CSL and PSH/PSL as one-line labels just right of the swing
point, under the line for a low and over it for a high. Switch code
comments, README and description to American spelling.

Co-Authored-By: Claude Opus 5.5 <noreply@anthropic.com>
Claude-Session: https://claude.ai/code/session_01UERYEZNYS5GmETbxiYGaDG
</commit_message>
<xml_diff>
--- a/pine/Trend_Segment_Boxes_Description.docx
+++ b/pine/Trend_Segment_Boxes_Description.docx
@@ -91,7 +91,7 @@
         </w:numPr>
       </w:pPr>
       <w:r>
-        <w:t xml:space="preserve">With "Snap points to bar high/low" enabled (the default), each point moves to the exact wick of the candle you clicked. It uses the high if the point is above its neighbours (a swing high) and the low if it is below them (a swing low).</w:t>
+        <w:t xml:space="preserve">With "Snap points to bar high/low" enabled (the default), each point moves to the exact wick of the candle you clicked. It uses the high if the point is above its neighbors (a swing high) and the low if it is below them (a swing low).</w:t>
       </w:r>
     </w:p>
     <w:p>
@@ -123,19 +123,19 @@
         </w:numPr>
       </w:pPr>
       <w:r>
-        <w:t xml:space="preserve">Rising legs use the "Up" colours and falling legs use the "Down" colours. A diagonal line connects the two swing points.</w:t>
-      </w:r>
-    </w:p>
-    <w:p>
-      <w:pPr>
-        <w:pStyle w:val="ListParagraph"/>
-        <w:numPr>
-          <w:ilvl w:val="0"/>
-          <w:numId w:val="2"/>
-        </w:numPr>
-      </w:pPr>
-      <w:r>
-        <w:t xml:space="preserve">A label on each leg shows the price change, the percentage change and the number of candles in the leg. It is centred on the leg, above the box for up legs and below it for down legs.</w:t>
+        <w:t xml:space="preserve">Rising legs use the "Up" colors and falling legs use the "Down" colors. A diagonal line connects the two swing points.</w:t>
+      </w:r>
+    </w:p>
+    <w:p>
+      <w:pPr>
+        <w:pStyle w:val="ListParagraph"/>
+        <w:numPr>
+          <w:ilvl w:val="0"/>
+          <w:numId w:val="2"/>
+        </w:numPr>
+      </w:pPr>
+      <w:r>
+        <w:t xml:space="preserve">A label on each leg shows the price change, the percentage change and the number of candles in the leg. It is centered on the leg, above the box for up legs and below it for down legs.</w:t>
       </w:r>
     </w:p>
     <w:p>
@@ -299,19 +299,19 @@
         </w:numPr>
       </w:pPr>
       <w:r>
-        <w:t xml:space="preserve">Style: snap to wicks; fill, border and line colours for up and down legs; show/hide diagonal lines and change labels; change label size.</w:t>
-      </w:r>
-    </w:p>
-    <w:p>
-      <w:pPr>
-        <w:pStyle w:val="ListParagraph"/>
-        <w:numPr>
-          <w:ilvl w:val="0"/>
-          <w:numId w:val="2"/>
-        </w:numPr>
-      </w:pPr>
-      <w:r>
-        <w:t xml:space="preserve">Controlling swing: show/hide the CSH/CSL and the PSH/PSL lines; colour, style (solid, dashed or dotted) and width of each line; swing label size.</w:t>
+        <w:t xml:space="preserve">Style: snap to wicks; fill, border and line colors for up and down legs; show/hide diagonal lines and change labels; change label size.</w:t>
+      </w:r>
+    </w:p>
+    <w:p>
+      <w:pPr>
+        <w:pStyle w:val="ListParagraph"/>
+        <w:numPr>
+          <w:ilvl w:val="0"/>
+          <w:numId w:val="2"/>
+        </w:numPr>
+      </w:pPr>
+      <w:r>
+        <w:t xml:space="preserve">Controlling swing: show/hide the CSH/CSL and the PSH/PSL lines; color, style (solid, dashed or dotted) and width of each line; swing label size.</w:t>
       </w:r>
     </w:p>
     <w:p>
@@ -356,18 +356,6 @@
       </w:pPr>
       <w:r>
         <w:t xml:space="preserve">The script can't read drawings made with TradingView's own drawing tools. Its points are set only through its own inputs.</w:t>
-      </w:r>
-    </w:p>
-    <w:p>
-      <w:pPr>
-        <w:pStyle w:val="ListParagraph"/>
-        <w:numPr>
-          <w:ilvl w:val="0"/>
-          <w:numId w:val="2"/>
-        </w:numPr>
-      </w:pPr>
-      <w:r>
-        <w:t xml:space="preserve">The labels stack the letters vertically, because Pine Script labels can't rotate text.</w:t>
       </w:r>
     </w:p>
     <w:p>

</xml_diff>

<commit_message>
Only draw on the symbol the swing points belong to
Indicators stay on the layout across symbol changes, so add a confirmed
"Show only on symbol" input and skip drawing on any other symbol.

Co-Authored-By: Claude Opus 5.5 <noreply@anthropic.com>
Claude-Session: https://claude.ai/code/session_01UERYEZNYS5GmETbxiYGaDG
</commit_message>
<xml_diff>
--- a/pine/Trend_Segment_Boxes_Description.docx
+++ b/pine/Trend_Segment_Boxes_Description.docx
@@ -80,6 +80,18 @@
       </w:pPr>
       <w:r>
         <w:t xml:space="preserve">Points are sorted by time, so the result doesn't depend on the order you click them in.</w:t>
+      </w:r>
+    </w:p>
+    <w:p>
+      <w:pPr>
+        <w:pStyle w:val="ListParagraph"/>
+        <w:numPr>
+          <w:ilvl w:val="0"/>
+          <w:numId w:val="2"/>
+        </w:numPr>
+      </w:pPr>
+      <w:r>
+        <w:t xml:space="preserve">You are also asked to confirm "Show only on symbol". The drawings appear only on that symbol, so switching the chart to another symbol doesn't carry your swing points over to it. Leave it empty to draw on every symbol.</w:t>
       </w:r>
     </w:p>
     <w:p>

</xml_diff>

<commit_message>
Explain that the indicator stays with the layout, not the symbol
Add a note to the README and the TradingView description covering the
symbol lock, per-stock layouts and native drawing-tool alternatives.

Co-Authored-By: Claude Opus 5.5 <noreply@anthropic.com>
Claude-Session: https://claude.ai/code/session_01UERYEZNYS5GmETbxiYGaDG
</commit_message>
<xml_diff>
--- a/pine/Trend_Segment_Boxes_Description.docx
+++ b/pine/Trend_Segment_Boxes_Description.docx
@@ -368,6 +368,18 @@
       </w:pPr>
       <w:r>
         <w:t xml:space="preserve">The script can't read drawings made with TradingView's own drawing tools. Its points are set only through its own inputs.</w:t>
+      </w:r>
+    </w:p>
+    <w:p>
+      <w:pPr>
+        <w:pStyle w:val="ListParagraph"/>
+        <w:numPr>
+          <w:ilvl w:val="0"/>
+          <w:numId w:val="2"/>
+        </w:numPr>
+      </w:pPr>
+      <w:r>
+        <w:t xml:space="preserve">This is an indicator, not a drawing tool. TradingView attaches indicators to the chart layout rather than to a symbol, so it stays on the chart when you switch symbols. Set "Show only on symbol" to keep the drawings on the stock you marked up, or use a separate chart layout for each stock. If you need markings that stay with the symbol, TradingView's own Date and Price Range and Horizontal Ray drawing tools can show similar information. With those, you identify the levels yourself and breaks aren't detected.</w:t>
       </w:r>
     </w:p>
     <w:p>

</xml_diff>